<commit_message>
List the PDF and Word export scripts in the reproducibility table
Section 9 of both reports now includes src/06c_report_pdf.py and
src/06d_report_docx.py. Markdown, PDF and .docx regenerated in English and
Spanish.

Co-Authored-By: Claude Opus 5.5 <noreply@anthropic.com>
</commit_message>
<xml_diff>
--- a/report/feature_selection_report.docx
+++ b/report/feature_selection_report.docx
@@ -14616,6 +14616,59 @@
                 <w:sz w:val="16"/>
               </w:rPr>
               <w:t>Final lists and this report</w:t>
+            </w:r>
+          </w:p>
+        </w:tc>
+      </w:tr>
+      <w:tr>
+        <w:trPr>
+          <w:cantSplit/>
+        </w:trPr>
+        <w:tc>
+          <w:tcPr>
+            <w:tcW w:type="dxa" w:w="6009"/>
+          </w:tcPr>
+          <w:p>
+            <w:pPr>
+              <w:spacing w:after="0"/>
+            </w:pPr>
+            <w:r>
+              <w:rPr>
+                <w:rFonts w:ascii="Courier New" w:hAnsi="Courier New" w:cs="Courier New" w:eastAsia="Courier New"/>
+                <w:sz w:val="15"/>
+              </w:rPr>
+              <w:t>src/06c_report_pdf.py</w:t>
+            </w:r>
+            <w:r>
+              <w:rPr>
+                <w:rFonts w:ascii="Arial" w:hAnsi="Arial" w:cs="Arial" w:eastAsia="Arial"/>
+                <w:sz w:val="16"/>
+              </w:rPr>
+              <w:t xml:space="preserve">, </w:t>
+            </w:r>
+            <w:r>
+              <w:rPr>
+                <w:rFonts w:ascii="Courier New" w:hAnsi="Courier New" w:cs="Courier New" w:eastAsia="Courier New"/>
+                <w:sz w:val="15"/>
+              </w:rPr>
+              <w:t>src/06d_report_docx.py</w:t>
+            </w:r>
+          </w:p>
+        </w:tc>
+        <w:tc>
+          <w:tcPr>
+            <w:tcW w:type="dxa" w:w="4082"/>
+          </w:tcPr>
+          <w:p>
+            <w:pPr>
+              <w:spacing w:after="0"/>
+            </w:pPr>
+            <w:r>
+              <w:rPr>
+                <w:rFonts w:ascii="Arial" w:hAnsi="Arial" w:cs="Arial" w:eastAsia="Arial"/>
+                <w:sz w:val="16"/>
+              </w:rPr>
+              <w:t>Export of this report to PDF and Word</w:t>
             </w:r>
           </w:p>
         </w:tc>

</xml_diff>